<commit_message>
chore: regenerate synthetic corpus
</commit_message>
<xml_diff>
--- a/data/synthetic/accounts/brannfeld_industrial/account_plan.docx
+++ b/data/synthetic/accounts/brannfeld_industrial/account_plan.docx
@@ -4,6 +4,7 @@
   <w:body>
     <w:p>
       <w:pPr>
+        <w:pStyle w:val="Title"/>
         <w:jc w:val="left"/>
       </w:pPr>
       <w:r>
@@ -16,6 +17,9 @@
       </w:r>
     </w:p>
     <w:p>
+      <w:pPr>
+        <w:pStyle w:val="Subtitle"/>
+      </w:pPr>
       <w:r>
         <w:rPr>
           <w:i/>

</xml_diff>